<commit_message>
Seitenzahlen angepasst, Spalte ergänzt
</commit_message>
<xml_diff>
--- a/Doc/Inhalt_Programmierkurs.docx
+++ b/Doc/Inhalt_Programmierkurs.docx
@@ -20,9 +20,10 @@
       </w:tblPr>
       <w:tblGrid>
         <w:gridCol w:w="575"/>
-        <w:gridCol w:w="10198"/>
-        <w:gridCol w:w="1847"/>
-        <w:gridCol w:w="1839"/>
+        <w:gridCol w:w="8353"/>
+        <w:gridCol w:w="1846"/>
+        <w:gridCol w:w="1842"/>
+        <w:gridCol w:w="1843"/>
       </w:tblGrid>
       <w:tr>
         <w:tc>
@@ -51,7 +52,7 @@
         </w:tc>
         <w:tc>
           <w:tcPr>
-            <w:tcW w:w="10198" w:type="dxa"/>
+            <w:tcW w:w="8353" w:type="dxa"/>
           </w:tcPr>
           <w:p>
             <w:pPr>
@@ -75,7 +76,7 @@
         </w:tc>
         <w:tc>
           <w:tcPr>
-            <w:tcW w:w="1847" w:type="dxa"/>
+            <w:tcW w:w="1846" w:type="dxa"/>
           </w:tcPr>
           <w:p>
             <w:pPr>
@@ -93,22 +94,13 @@
                 <w:sz w:val="28"/>
                 <w:szCs w:val="28"/>
               </w:rPr>
-              <w:t>Arbeitsblätter</w:t>
-            </w:r>
-            <w:r>
-              <w:rPr>
-                <w:b/>
-                <w:bCs/>
-                <w:sz w:val="28"/>
-                <w:szCs w:val="28"/>
-              </w:rPr>
-              <w:t xml:space="preserve"> Seiten</w:t>
-            </w:r>
-          </w:p>
-        </w:tc>
-        <w:tc>
-          <w:tcPr>
-            <w:tcW w:w="1839" w:type="dxa"/>
+              <w:t>Arbeitsblätter Seiten</w:t>
+            </w:r>
+          </w:p>
+        </w:tc>
+        <w:tc>
+          <w:tcPr>
+            <w:tcW w:w="1842" w:type="dxa"/>
             <w:tcBorders>
               <w:bottom w:val="single" w:sz="4" w:space="0" w:color="auto"/>
             </w:tcBorders>
@@ -158,6 +150,61 @@
                 <w:szCs w:val="28"/>
               </w:rPr>
               <w:t>geschätzt</w:t>
+            </w:r>
+          </w:p>
+        </w:tc>
+        <w:tc>
+          <w:tcPr>
+            <w:tcW w:w="1843" w:type="dxa"/>
+            <w:tcBorders>
+              <w:bottom w:val="single" w:sz="4" w:space="0" w:color="auto"/>
+            </w:tcBorders>
+          </w:tcPr>
+          <w:p>
+            <w:pPr>
+              <w:rPr>
+                <w:b/>
+                <w:bCs/>
+                <w:sz w:val="28"/>
+                <w:szCs w:val="28"/>
+              </w:rPr>
+            </w:pPr>
+            <w:r>
+              <w:rPr>
+                <w:b/>
+                <w:bCs/>
+                <w:sz w:val="28"/>
+                <w:szCs w:val="28"/>
+              </w:rPr>
+              <w:t>Kurs</w:t>
+            </w:r>
+            <w:r>
+              <w:rPr>
+                <w:b/>
+                <w:bCs/>
+                <w:sz w:val="28"/>
+                <w:szCs w:val="28"/>
+              </w:rPr>
+              <w:t>einheiten</w:t>
+            </w:r>
+          </w:p>
+          <w:p>
+            <w:pPr>
+              <w:rPr>
+                <w:b/>
+                <w:bCs/>
+                <w:sz w:val="28"/>
+                <w:szCs w:val="28"/>
+              </w:rPr>
+            </w:pPr>
+            <w:r>
+              <w:rPr>
+                <w:b/>
+                <w:bCs/>
+                <w:sz w:val="28"/>
+                <w:szCs w:val="28"/>
+              </w:rPr>
+              <w:t>gemacht</w:t>
             </w:r>
           </w:p>
         </w:tc>
@@ -184,56 +231,47 @@
         </w:tc>
         <w:tc>
           <w:tcPr>
-            <w:tcW w:w="10198" w:type="dxa"/>
-          </w:tcPr>
-          <w:p>
-            <w:pPr>
-              <w:rPr>
-                <w:sz w:val="28"/>
-                <w:szCs w:val="28"/>
-              </w:rPr>
-            </w:pPr>
-            <w:r>
-              <w:rPr>
-                <w:sz w:val="28"/>
-                <w:szCs w:val="28"/>
-              </w:rPr>
-              <w:t xml:space="preserve">IDLE Shell und </w:t>
-            </w:r>
-            <w:proofErr w:type="gramStart"/>
-            <w:r>
-              <w:rPr>
-                <w:sz w:val="28"/>
-                <w:szCs w:val="28"/>
-              </w:rPr>
-              <w:t>IDLE Editor</w:t>
-            </w:r>
-            <w:proofErr w:type="gramEnd"/>
-          </w:p>
-        </w:tc>
-        <w:tc>
-          <w:tcPr>
-            <w:tcW w:w="1847" w:type="dxa"/>
-          </w:tcPr>
-          <w:p>
-            <w:pPr>
-              <w:rPr>
-                <w:sz w:val="28"/>
-                <w:szCs w:val="28"/>
-              </w:rPr>
-            </w:pPr>
-            <w:r>
-              <w:rPr>
-                <w:sz w:val="28"/>
-                <w:szCs w:val="28"/>
-              </w:rPr>
-              <w:t>2, 3, 4, 5</w:t>
-            </w:r>
-          </w:p>
-        </w:tc>
-        <w:tc>
-          <w:tcPr>
-            <w:tcW w:w="1839" w:type="dxa"/>
+            <w:tcW w:w="8353" w:type="dxa"/>
+          </w:tcPr>
+          <w:p>
+            <w:pPr>
+              <w:rPr>
+                <w:sz w:val="28"/>
+                <w:szCs w:val="28"/>
+              </w:rPr>
+            </w:pPr>
+            <w:r>
+              <w:rPr>
+                <w:sz w:val="28"/>
+                <w:szCs w:val="28"/>
+              </w:rPr>
+              <w:t>IDLE Shell und IDLE Editor</w:t>
+            </w:r>
+          </w:p>
+        </w:tc>
+        <w:tc>
+          <w:tcPr>
+            <w:tcW w:w="1846" w:type="dxa"/>
+          </w:tcPr>
+          <w:p>
+            <w:pPr>
+              <w:rPr>
+                <w:sz w:val="28"/>
+                <w:szCs w:val="28"/>
+              </w:rPr>
+            </w:pPr>
+            <w:r>
+              <w:rPr>
+                <w:sz w:val="28"/>
+                <w:szCs w:val="28"/>
+              </w:rPr>
+              <w:t>3, 4, 5, 6</w:t>
+            </w:r>
+          </w:p>
+        </w:tc>
+        <w:tc>
+          <w:tcPr>
+            <w:tcW w:w="1842" w:type="dxa"/>
             <w:tcBorders>
               <w:bottom w:val="single" w:sz="4" w:space="0" w:color="auto"/>
             </w:tcBorders>
@@ -251,6 +289,29 @@
                 <w:szCs w:val="28"/>
               </w:rPr>
               <w:t>1, 2</w:t>
+            </w:r>
+          </w:p>
+        </w:tc>
+        <w:tc>
+          <w:tcPr>
+            <w:tcW w:w="1843" w:type="dxa"/>
+            <w:tcBorders>
+              <w:bottom w:val="single" w:sz="4" w:space="0" w:color="auto"/>
+            </w:tcBorders>
+          </w:tcPr>
+          <w:p>
+            <w:pPr>
+              <w:rPr>
+                <w:sz w:val="28"/>
+                <w:szCs w:val="28"/>
+              </w:rPr>
+            </w:pPr>
+            <w:r>
+              <w:rPr>
+                <w:sz w:val="28"/>
+                <w:szCs w:val="28"/>
+              </w:rPr>
+              <w:t>1</w:t>
             </w:r>
           </w:p>
         </w:tc>
@@ -277,7 +338,7 @@
         </w:tc>
         <w:tc>
           <w:tcPr>
-            <w:tcW w:w="10198" w:type="dxa"/>
+            <w:tcW w:w="8353" w:type="dxa"/>
           </w:tcPr>
           <w:p>
             <w:pPr>
@@ -297,27 +358,27 @@
         </w:tc>
         <w:tc>
           <w:tcPr>
-            <w:tcW w:w="1847" w:type="dxa"/>
-          </w:tcPr>
-          <w:p>
-            <w:pPr>
-              <w:rPr>
-                <w:sz w:val="28"/>
-                <w:szCs w:val="28"/>
-              </w:rPr>
-            </w:pPr>
-            <w:r>
-              <w:rPr>
-                <w:sz w:val="28"/>
-                <w:szCs w:val="28"/>
-              </w:rPr>
-              <w:t>6, 7, 8</w:t>
-            </w:r>
-          </w:p>
-        </w:tc>
-        <w:tc>
-          <w:tcPr>
-            <w:tcW w:w="1839" w:type="dxa"/>
+            <w:tcW w:w="1846" w:type="dxa"/>
+          </w:tcPr>
+          <w:p>
+            <w:pPr>
+              <w:rPr>
+                <w:sz w:val="28"/>
+                <w:szCs w:val="28"/>
+              </w:rPr>
+            </w:pPr>
+            <w:r>
+              <w:rPr>
+                <w:sz w:val="28"/>
+                <w:szCs w:val="28"/>
+              </w:rPr>
+              <w:t>7, 8, 9</w:t>
+            </w:r>
+          </w:p>
+        </w:tc>
+        <w:tc>
+          <w:tcPr>
+            <w:tcW w:w="1842" w:type="dxa"/>
             <w:tcBorders>
               <w:top w:val="single" w:sz="4" w:space="0" w:color="auto"/>
               <w:bottom w:val="single" w:sz="4" w:space="0" w:color="auto"/>
@@ -337,6 +398,23 @@
               </w:rPr>
               <w:t>3</w:t>
             </w:r>
+          </w:p>
+        </w:tc>
+        <w:tc>
+          <w:tcPr>
+            <w:tcW w:w="1843" w:type="dxa"/>
+            <w:tcBorders>
+              <w:top w:val="single" w:sz="4" w:space="0" w:color="auto"/>
+              <w:bottom w:val="single" w:sz="4" w:space="0" w:color="auto"/>
+            </w:tcBorders>
+          </w:tcPr>
+          <w:p>
+            <w:pPr>
+              <w:rPr>
+                <w:sz w:val="28"/>
+                <w:szCs w:val="28"/>
+              </w:rPr>
+            </w:pPr>
           </w:p>
         </w:tc>
       </w:tr>
@@ -362,7 +440,7 @@
         </w:tc>
         <w:tc>
           <w:tcPr>
-            <w:tcW w:w="10198" w:type="dxa"/>
+            <w:tcW w:w="8353" w:type="dxa"/>
           </w:tcPr>
           <w:p>
             <w:pPr>
@@ -382,27 +460,27 @@
         </w:tc>
         <w:tc>
           <w:tcPr>
-            <w:tcW w:w="1847" w:type="dxa"/>
-          </w:tcPr>
-          <w:p>
-            <w:pPr>
-              <w:rPr>
-                <w:sz w:val="28"/>
-                <w:szCs w:val="28"/>
-              </w:rPr>
-            </w:pPr>
-            <w:r>
-              <w:rPr>
-                <w:sz w:val="28"/>
-                <w:szCs w:val="28"/>
-              </w:rPr>
-              <w:t>9</w:t>
-            </w:r>
-          </w:p>
-        </w:tc>
-        <w:tc>
-          <w:tcPr>
-            <w:tcW w:w="1839" w:type="dxa"/>
+            <w:tcW w:w="1846" w:type="dxa"/>
+          </w:tcPr>
+          <w:p>
+            <w:pPr>
+              <w:rPr>
+                <w:sz w:val="28"/>
+                <w:szCs w:val="28"/>
+              </w:rPr>
+            </w:pPr>
+            <w:r>
+              <w:rPr>
+                <w:sz w:val="28"/>
+                <w:szCs w:val="28"/>
+              </w:rPr>
+              <w:t>10</w:t>
+            </w:r>
+          </w:p>
+        </w:tc>
+        <w:tc>
+          <w:tcPr>
+            <w:tcW w:w="1842" w:type="dxa"/>
             <w:tcBorders>
               <w:top w:val="single" w:sz="4" w:space="0" w:color="auto"/>
             </w:tcBorders>
@@ -421,6 +499,22 @@
               </w:rPr>
               <w:t>4</w:t>
             </w:r>
+          </w:p>
+        </w:tc>
+        <w:tc>
+          <w:tcPr>
+            <w:tcW w:w="1843" w:type="dxa"/>
+            <w:tcBorders>
+              <w:top w:val="single" w:sz="4" w:space="0" w:color="auto"/>
+            </w:tcBorders>
+          </w:tcPr>
+          <w:p>
+            <w:pPr>
+              <w:rPr>
+                <w:sz w:val="28"/>
+                <w:szCs w:val="28"/>
+              </w:rPr>
+            </w:pPr>
           </w:p>
         </w:tc>
       </w:tr>
@@ -446,7 +540,7 @@
         </w:tc>
         <w:tc>
           <w:tcPr>
-            <w:tcW w:w="10198" w:type="dxa"/>
+            <w:tcW w:w="8353" w:type="dxa"/>
           </w:tcPr>
           <w:p>
             <w:pPr>
@@ -466,27 +560,27 @@
         </w:tc>
         <w:tc>
           <w:tcPr>
-            <w:tcW w:w="1847" w:type="dxa"/>
-          </w:tcPr>
-          <w:p>
-            <w:pPr>
-              <w:rPr>
-                <w:sz w:val="28"/>
-                <w:szCs w:val="28"/>
-              </w:rPr>
-            </w:pPr>
-            <w:r>
-              <w:rPr>
-                <w:sz w:val="28"/>
-                <w:szCs w:val="28"/>
-              </w:rPr>
-              <w:t>10, 11</w:t>
-            </w:r>
-          </w:p>
-        </w:tc>
-        <w:tc>
-          <w:tcPr>
-            <w:tcW w:w="1839" w:type="dxa"/>
+            <w:tcW w:w="1846" w:type="dxa"/>
+          </w:tcPr>
+          <w:p>
+            <w:pPr>
+              <w:rPr>
+                <w:sz w:val="28"/>
+                <w:szCs w:val="28"/>
+              </w:rPr>
+            </w:pPr>
+            <w:r>
+              <w:rPr>
+                <w:sz w:val="28"/>
+                <w:szCs w:val="28"/>
+              </w:rPr>
+              <w:t>11, 12</w:t>
+            </w:r>
+          </w:p>
+        </w:tc>
+        <w:tc>
+          <w:tcPr>
+            <w:tcW w:w="1842" w:type="dxa"/>
             <w:tcBorders>
               <w:bottom w:val="single" w:sz="4" w:space="0" w:color="auto"/>
             </w:tcBorders>
@@ -505,6 +599,22 @@
               </w:rPr>
               <w:t>5</w:t>
             </w:r>
+          </w:p>
+        </w:tc>
+        <w:tc>
+          <w:tcPr>
+            <w:tcW w:w="1843" w:type="dxa"/>
+            <w:tcBorders>
+              <w:bottom w:val="single" w:sz="4" w:space="0" w:color="auto"/>
+            </w:tcBorders>
+          </w:tcPr>
+          <w:p>
+            <w:pPr>
+              <w:rPr>
+                <w:sz w:val="28"/>
+                <w:szCs w:val="28"/>
+              </w:rPr>
+            </w:pPr>
           </w:p>
         </w:tc>
       </w:tr>
@@ -530,7 +640,7 @@
         </w:tc>
         <w:tc>
           <w:tcPr>
-            <w:tcW w:w="10198" w:type="dxa"/>
+            <w:tcW w:w="8353" w:type="dxa"/>
           </w:tcPr>
           <w:p>
             <w:pPr>
@@ -550,27 +660,27 @@
         </w:tc>
         <w:tc>
           <w:tcPr>
-            <w:tcW w:w="1847" w:type="dxa"/>
-          </w:tcPr>
-          <w:p>
-            <w:pPr>
-              <w:rPr>
-                <w:sz w:val="28"/>
-                <w:szCs w:val="28"/>
-              </w:rPr>
-            </w:pPr>
-            <w:r>
-              <w:rPr>
-                <w:sz w:val="28"/>
-                <w:szCs w:val="28"/>
-              </w:rPr>
-              <w:t>12, 13</w:t>
-            </w:r>
-          </w:p>
-        </w:tc>
-        <w:tc>
-          <w:tcPr>
-            <w:tcW w:w="1839" w:type="dxa"/>
+            <w:tcW w:w="1846" w:type="dxa"/>
+          </w:tcPr>
+          <w:p>
+            <w:pPr>
+              <w:rPr>
+                <w:sz w:val="28"/>
+                <w:szCs w:val="28"/>
+              </w:rPr>
+            </w:pPr>
+            <w:r>
+              <w:rPr>
+                <w:sz w:val="28"/>
+                <w:szCs w:val="28"/>
+              </w:rPr>
+              <w:t>13, 14</w:t>
+            </w:r>
+          </w:p>
+        </w:tc>
+        <w:tc>
+          <w:tcPr>
+            <w:tcW w:w="1842" w:type="dxa"/>
             <w:tcBorders>
               <w:bottom w:val="single" w:sz="4" w:space="0" w:color="auto"/>
             </w:tcBorders>
@@ -589,6 +699,22 @@
               </w:rPr>
               <w:t>6</w:t>
             </w:r>
+          </w:p>
+        </w:tc>
+        <w:tc>
+          <w:tcPr>
+            <w:tcW w:w="1843" w:type="dxa"/>
+            <w:tcBorders>
+              <w:bottom w:val="single" w:sz="4" w:space="0" w:color="auto"/>
+            </w:tcBorders>
+          </w:tcPr>
+          <w:p>
+            <w:pPr>
+              <w:rPr>
+                <w:sz w:val="28"/>
+                <w:szCs w:val="28"/>
+              </w:rPr>
+            </w:pPr>
           </w:p>
         </w:tc>
       </w:tr>
@@ -614,7 +740,7 @@
         </w:tc>
         <w:tc>
           <w:tcPr>
-            <w:tcW w:w="10198" w:type="dxa"/>
+            <w:tcW w:w="8353" w:type="dxa"/>
           </w:tcPr>
           <w:p>
             <w:pPr>
@@ -634,27 +760,27 @@
         </w:tc>
         <w:tc>
           <w:tcPr>
-            <w:tcW w:w="1847" w:type="dxa"/>
-          </w:tcPr>
-          <w:p>
-            <w:pPr>
-              <w:rPr>
-                <w:sz w:val="28"/>
-                <w:szCs w:val="28"/>
-              </w:rPr>
-            </w:pPr>
-            <w:r>
-              <w:rPr>
-                <w:sz w:val="28"/>
-                <w:szCs w:val="28"/>
-              </w:rPr>
-              <w:t>14, 15</w:t>
-            </w:r>
-          </w:p>
-        </w:tc>
-        <w:tc>
-          <w:tcPr>
-            <w:tcW w:w="1839" w:type="dxa"/>
+            <w:tcW w:w="1846" w:type="dxa"/>
+          </w:tcPr>
+          <w:p>
+            <w:pPr>
+              <w:rPr>
+                <w:sz w:val="28"/>
+                <w:szCs w:val="28"/>
+              </w:rPr>
+            </w:pPr>
+            <w:r>
+              <w:rPr>
+                <w:sz w:val="28"/>
+                <w:szCs w:val="28"/>
+              </w:rPr>
+              <w:t>15, 16</w:t>
+            </w:r>
+          </w:p>
+        </w:tc>
+        <w:tc>
+          <w:tcPr>
+            <w:tcW w:w="1842" w:type="dxa"/>
             <w:tcBorders>
               <w:bottom w:val="single" w:sz="4" w:space="0" w:color="auto"/>
             </w:tcBorders>
@@ -673,6 +799,22 @@
               </w:rPr>
               <w:t>7</w:t>
             </w:r>
+          </w:p>
+        </w:tc>
+        <w:tc>
+          <w:tcPr>
+            <w:tcW w:w="1843" w:type="dxa"/>
+            <w:tcBorders>
+              <w:bottom w:val="single" w:sz="4" w:space="0" w:color="auto"/>
+            </w:tcBorders>
+          </w:tcPr>
+          <w:p>
+            <w:pPr>
+              <w:rPr>
+                <w:sz w:val="28"/>
+                <w:szCs w:val="28"/>
+              </w:rPr>
+            </w:pPr>
           </w:p>
         </w:tc>
       </w:tr>
@@ -698,61 +840,47 @@
         </w:tc>
         <w:tc>
           <w:tcPr>
-            <w:tcW w:w="10198" w:type="dxa"/>
-          </w:tcPr>
-          <w:p>
-            <w:pPr>
-              <w:rPr>
-                <w:sz w:val="28"/>
-                <w:szCs w:val="28"/>
-              </w:rPr>
-            </w:pPr>
-            <w:r>
-              <w:rPr>
-                <w:sz w:val="28"/>
-                <w:szCs w:val="28"/>
-              </w:rPr>
-              <w:t xml:space="preserve">Aufgaben mit </w:t>
-            </w:r>
-            <w:r>
-              <w:rPr>
-                <w:sz w:val="28"/>
-                <w:szCs w:val="28"/>
-              </w:rPr>
-              <w:t>Funktionen</w:t>
-            </w:r>
-            <w:r>
-              <w:rPr>
-                <w:sz w:val="28"/>
-                <w:szCs w:val="28"/>
-              </w:rPr>
-              <w:t xml:space="preserve"> lösen</w:t>
-            </w:r>
-          </w:p>
-        </w:tc>
-        <w:tc>
-          <w:tcPr>
-            <w:tcW w:w="1847" w:type="dxa"/>
-          </w:tcPr>
-          <w:p>
-            <w:pPr>
-              <w:rPr>
-                <w:sz w:val="28"/>
-                <w:szCs w:val="28"/>
-              </w:rPr>
-            </w:pPr>
-            <w:r>
-              <w:rPr>
-                <w:sz w:val="28"/>
-                <w:szCs w:val="28"/>
-              </w:rPr>
-              <w:t>16, 17, 18</w:t>
-            </w:r>
-          </w:p>
-        </w:tc>
-        <w:tc>
-          <w:tcPr>
-            <w:tcW w:w="1839" w:type="dxa"/>
+            <w:tcW w:w="8353" w:type="dxa"/>
+          </w:tcPr>
+          <w:p>
+            <w:pPr>
+              <w:rPr>
+                <w:sz w:val="28"/>
+                <w:szCs w:val="28"/>
+              </w:rPr>
+            </w:pPr>
+            <w:r>
+              <w:rPr>
+                <w:sz w:val="28"/>
+                <w:szCs w:val="28"/>
+              </w:rPr>
+              <w:t>Aufgaben mit Funktionen lösen</w:t>
+            </w:r>
+          </w:p>
+        </w:tc>
+        <w:tc>
+          <w:tcPr>
+            <w:tcW w:w="1846" w:type="dxa"/>
+          </w:tcPr>
+          <w:p>
+            <w:pPr>
+              <w:rPr>
+                <w:sz w:val="28"/>
+                <w:szCs w:val="28"/>
+              </w:rPr>
+            </w:pPr>
+            <w:r>
+              <w:rPr>
+                <w:sz w:val="28"/>
+                <w:szCs w:val="28"/>
+              </w:rPr>
+              <w:t>17, 18, 19</w:t>
+            </w:r>
+          </w:p>
+        </w:tc>
+        <w:tc>
+          <w:tcPr>
+            <w:tcW w:w="1842" w:type="dxa"/>
             <w:tcBorders>
               <w:bottom w:val="single" w:sz="4" w:space="0" w:color="auto"/>
             </w:tcBorders>
@@ -771,6 +899,22 @@
               </w:rPr>
               <w:t>8, 9</w:t>
             </w:r>
+          </w:p>
+        </w:tc>
+        <w:tc>
+          <w:tcPr>
+            <w:tcW w:w="1843" w:type="dxa"/>
+            <w:tcBorders>
+              <w:bottom w:val="single" w:sz="4" w:space="0" w:color="auto"/>
+            </w:tcBorders>
+          </w:tcPr>
+          <w:p>
+            <w:pPr>
+              <w:rPr>
+                <w:sz w:val="28"/>
+                <w:szCs w:val="28"/>
+              </w:rPr>
+            </w:pPr>
           </w:p>
         </w:tc>
       </w:tr>
@@ -796,7 +940,7 @@
         </w:tc>
         <w:tc>
           <w:tcPr>
-            <w:tcW w:w="10198" w:type="dxa"/>
+            <w:tcW w:w="8353" w:type="dxa"/>
           </w:tcPr>
           <w:p>
             <w:pPr>
@@ -816,27 +960,27 @@
         </w:tc>
         <w:tc>
           <w:tcPr>
-            <w:tcW w:w="1847" w:type="dxa"/>
-          </w:tcPr>
-          <w:p>
-            <w:pPr>
-              <w:rPr>
-                <w:sz w:val="28"/>
-                <w:szCs w:val="28"/>
-              </w:rPr>
-            </w:pPr>
-            <w:r>
-              <w:rPr>
-                <w:sz w:val="28"/>
-                <w:szCs w:val="28"/>
-              </w:rPr>
-              <w:t>19, 20</w:t>
-            </w:r>
-          </w:p>
-        </w:tc>
-        <w:tc>
-          <w:tcPr>
-            <w:tcW w:w="1839" w:type="dxa"/>
+            <w:tcW w:w="1846" w:type="dxa"/>
+          </w:tcPr>
+          <w:p>
+            <w:pPr>
+              <w:rPr>
+                <w:sz w:val="28"/>
+                <w:szCs w:val="28"/>
+              </w:rPr>
+            </w:pPr>
+            <w:r>
+              <w:rPr>
+                <w:sz w:val="28"/>
+                <w:szCs w:val="28"/>
+              </w:rPr>
+              <w:t>20, 21</w:t>
+            </w:r>
+          </w:p>
+        </w:tc>
+        <w:tc>
+          <w:tcPr>
+            <w:tcW w:w="1842" w:type="dxa"/>
             <w:tcBorders>
               <w:top w:val="single" w:sz="4" w:space="0" w:color="auto"/>
               <w:bottom w:val="single" w:sz="4" w:space="0" w:color="auto"/>
@@ -856,6 +1000,23 @@
               </w:rPr>
               <w:t>10</w:t>
             </w:r>
+          </w:p>
+        </w:tc>
+        <w:tc>
+          <w:tcPr>
+            <w:tcW w:w="1843" w:type="dxa"/>
+            <w:tcBorders>
+              <w:top w:val="single" w:sz="4" w:space="0" w:color="auto"/>
+              <w:bottom w:val="single" w:sz="4" w:space="0" w:color="auto"/>
+            </w:tcBorders>
+          </w:tcPr>
+          <w:p>
+            <w:pPr>
+              <w:rPr>
+                <w:sz w:val="28"/>
+                <w:szCs w:val="28"/>
+              </w:rPr>
+            </w:pPr>
           </w:p>
         </w:tc>
       </w:tr>
@@ -881,28 +1042,21 @@
         </w:tc>
         <w:tc>
           <w:tcPr>
-            <w:tcW w:w="10198" w:type="dxa"/>
-          </w:tcPr>
-          <w:p>
-            <w:pPr>
-              <w:rPr>
-                <w:sz w:val="28"/>
-                <w:szCs w:val="28"/>
-              </w:rPr>
-            </w:pPr>
-            <w:r>
-              <w:rPr>
-                <w:sz w:val="28"/>
-                <w:szCs w:val="28"/>
-              </w:rPr>
-              <w:t>Anwendung (1):</w:t>
-            </w:r>
-            <w:r>
-              <w:rPr>
-                <w:sz w:val="28"/>
-                <w:szCs w:val="28"/>
-              </w:rPr>
-              <w:t xml:space="preserve"> </w:t>
+            <w:tcW w:w="8353" w:type="dxa"/>
+          </w:tcPr>
+          <w:p>
+            <w:pPr>
+              <w:rPr>
+                <w:sz w:val="28"/>
+                <w:szCs w:val="28"/>
+              </w:rPr>
+            </w:pPr>
+            <w:r>
+              <w:rPr>
+                <w:sz w:val="28"/>
+                <w:szCs w:val="28"/>
+              </w:rPr>
+              <w:t xml:space="preserve">Anwendung (1): </w:t>
             </w:r>
             <w:r>
               <w:rPr>
@@ -910,75 +1064,33 @@
                 <w:szCs w:val="28"/>
               </w:rPr>
               <w:br/>
-              <w:t xml:space="preserve">Ein animierter </w:t>
-            </w:r>
-            <w:r>
-              <w:rPr>
-                <w:sz w:val="28"/>
-                <w:szCs w:val="28"/>
-              </w:rPr>
-              <w:t>Robote</w:t>
-            </w:r>
-            <w:r>
-              <w:rPr>
-                <w:sz w:val="28"/>
-                <w:szCs w:val="28"/>
-              </w:rPr>
-              <w:t>r, der</w:t>
-            </w:r>
-            <w:r>
-              <w:rPr>
-                <w:sz w:val="28"/>
-                <w:szCs w:val="28"/>
-              </w:rPr>
-              <w:t xml:space="preserve"> selbstständig den Weg aus </w:t>
-            </w:r>
-            <w:r>
-              <w:rPr>
-                <w:sz w:val="28"/>
-                <w:szCs w:val="28"/>
-              </w:rPr>
-              <w:t>einem</w:t>
-            </w:r>
-            <w:r>
-              <w:rPr>
-                <w:sz w:val="28"/>
-                <w:szCs w:val="28"/>
-              </w:rPr>
-              <w:t xml:space="preserve"> Irrgarten</w:t>
-            </w:r>
-            <w:r>
-              <w:rPr>
-                <w:sz w:val="28"/>
-                <w:szCs w:val="28"/>
-              </w:rPr>
-              <w:t xml:space="preserve"> findet</w:t>
-            </w:r>
-          </w:p>
-        </w:tc>
-        <w:tc>
-          <w:tcPr>
-            <w:tcW w:w="1847" w:type="dxa"/>
-          </w:tcPr>
-          <w:p>
-            <w:pPr>
-              <w:rPr>
-                <w:sz w:val="28"/>
-                <w:szCs w:val="28"/>
-              </w:rPr>
-            </w:pPr>
-            <w:r>
-              <w:rPr>
-                <w:sz w:val="28"/>
-                <w:szCs w:val="28"/>
-              </w:rPr>
-              <w:t>21, 22, 23, 24, 25, 26, 27, 28</w:t>
-            </w:r>
-          </w:p>
-        </w:tc>
-        <w:tc>
-          <w:tcPr>
-            <w:tcW w:w="1839" w:type="dxa"/>
+              <w:t>Ein animierter Roboter, der selbstständig den Weg aus einem Irrgarten findet</w:t>
+            </w:r>
+          </w:p>
+        </w:tc>
+        <w:tc>
+          <w:tcPr>
+            <w:tcW w:w="1846" w:type="dxa"/>
+          </w:tcPr>
+          <w:p>
+            <w:pPr>
+              <w:rPr>
+                <w:sz w:val="28"/>
+                <w:szCs w:val="28"/>
+              </w:rPr>
+            </w:pPr>
+            <w:r>
+              <w:rPr>
+                <w:sz w:val="28"/>
+                <w:szCs w:val="28"/>
+              </w:rPr>
+              <w:t>22, 23, 24, 25, 26, 27, 28, 29</w:t>
+            </w:r>
+          </w:p>
+        </w:tc>
+        <w:tc>
+          <w:tcPr>
+            <w:tcW w:w="1842" w:type="dxa"/>
             <w:tcBorders>
               <w:bottom w:val="single" w:sz="4" w:space="0" w:color="auto"/>
             </w:tcBorders>
@@ -997,6 +1109,22 @@
               </w:rPr>
               <w:t xml:space="preserve">11, 12, 13, 14, </w:t>
             </w:r>
+          </w:p>
+        </w:tc>
+        <w:tc>
+          <w:tcPr>
+            <w:tcW w:w="1843" w:type="dxa"/>
+            <w:tcBorders>
+              <w:bottom w:val="single" w:sz="4" w:space="0" w:color="auto"/>
+            </w:tcBorders>
+          </w:tcPr>
+          <w:p>
+            <w:pPr>
+              <w:rPr>
+                <w:sz w:val="28"/>
+                <w:szCs w:val="28"/>
+              </w:rPr>
+            </w:pPr>
           </w:p>
         </w:tc>
       </w:tr>
@@ -1022,42 +1150,21 @@
         </w:tc>
         <w:tc>
           <w:tcPr>
-            <w:tcW w:w="10198" w:type="dxa"/>
-          </w:tcPr>
-          <w:p>
-            <w:pPr>
-              <w:rPr>
-                <w:sz w:val="28"/>
-                <w:szCs w:val="28"/>
-              </w:rPr>
-            </w:pPr>
-            <w:r>
-              <w:rPr>
-                <w:sz w:val="28"/>
-                <w:szCs w:val="28"/>
-              </w:rPr>
-              <w:t xml:space="preserve">Anwendung </w:t>
-            </w:r>
-            <w:r>
-              <w:rPr>
-                <w:sz w:val="28"/>
-                <w:szCs w:val="28"/>
-              </w:rPr>
-              <w:t>(2)</w:t>
-            </w:r>
-            <w:r>
-              <w:rPr>
-                <w:sz w:val="28"/>
-                <w:szCs w:val="28"/>
-              </w:rPr>
-              <w:t xml:space="preserve">: </w:t>
-            </w:r>
-            <w:r>
-              <w:rPr>
-                <w:sz w:val="28"/>
-                <w:szCs w:val="28"/>
-              </w:rPr>
-              <w:t xml:space="preserve"> </w:t>
+            <w:tcW w:w="8353" w:type="dxa"/>
+          </w:tcPr>
+          <w:p>
+            <w:pPr>
+              <w:rPr>
+                <w:sz w:val="28"/>
+                <w:szCs w:val="28"/>
+              </w:rPr>
+            </w:pPr>
+            <w:r>
+              <w:rPr>
+                <w:sz w:val="28"/>
+                <w:szCs w:val="28"/>
+              </w:rPr>
+              <w:t xml:space="preserve">Anwendung (2):  </w:t>
             </w:r>
             <w:r>
               <w:rPr>
@@ -1065,76 +1172,33 @@
                 <w:szCs w:val="28"/>
               </w:rPr>
               <w:br/>
-              <w:t xml:space="preserve">Ein </w:t>
-            </w:r>
-            <w:r>
-              <w:rPr>
-                <w:sz w:val="28"/>
-                <w:szCs w:val="28"/>
-              </w:rPr>
-              <w:t>Computerspiel</w:t>
-            </w:r>
-            <w:r>
-              <w:rPr>
-                <w:sz w:val="28"/>
-                <w:szCs w:val="28"/>
-              </w:rPr>
-              <w:t xml:space="preserve"> mit einem animierten</w:t>
-            </w:r>
-            <w:r>
-              <w:rPr>
-                <w:sz w:val="28"/>
-                <w:szCs w:val="28"/>
-              </w:rPr>
-              <w:t xml:space="preserve"> Auto und Gegenverkehr</w:t>
-            </w:r>
-            <w:r>
-              <w:rPr>
-                <w:sz w:val="28"/>
-                <w:szCs w:val="28"/>
-              </w:rPr>
-              <w:t>. Ihr steuert das Auto.</w:t>
-            </w:r>
-          </w:p>
-        </w:tc>
-        <w:tc>
-          <w:tcPr>
-            <w:tcW w:w="1847" w:type="dxa"/>
-          </w:tcPr>
-          <w:p>
-            <w:pPr>
-              <w:rPr>
-                <w:sz w:val="28"/>
-                <w:szCs w:val="28"/>
-              </w:rPr>
-            </w:pPr>
-            <w:r>
-              <w:rPr>
-                <w:sz w:val="28"/>
-                <w:szCs w:val="28"/>
-              </w:rPr>
-              <w:t>29, 30, 31, 32,</w:t>
-            </w:r>
-          </w:p>
-          <w:p>
-            <w:pPr>
-              <w:rPr>
-                <w:sz w:val="28"/>
-                <w:szCs w:val="28"/>
-              </w:rPr>
-            </w:pPr>
-            <w:r>
-              <w:rPr>
-                <w:sz w:val="28"/>
-                <w:szCs w:val="28"/>
-              </w:rPr>
-              <w:t>33, 34, 35, 36</w:t>
-            </w:r>
-          </w:p>
-        </w:tc>
-        <w:tc>
-          <w:tcPr>
-            <w:tcW w:w="1839" w:type="dxa"/>
+              <w:t>Ein Computerspiel mit einem animierten Auto und Gegenverkehr. Ihr steuert das Auto.</w:t>
+            </w:r>
+          </w:p>
+        </w:tc>
+        <w:tc>
+          <w:tcPr>
+            <w:tcW w:w="1846" w:type="dxa"/>
+          </w:tcPr>
+          <w:p>
+            <w:pPr>
+              <w:rPr>
+                <w:sz w:val="28"/>
+                <w:szCs w:val="28"/>
+              </w:rPr>
+            </w:pPr>
+            <w:r>
+              <w:rPr>
+                <w:sz w:val="28"/>
+                <w:szCs w:val="28"/>
+              </w:rPr>
+              <w:t>30, 31, 32, 33, 34, 35, 36, 37</w:t>
+            </w:r>
+          </w:p>
+        </w:tc>
+        <w:tc>
+          <w:tcPr>
+            <w:tcW w:w="1842" w:type="dxa"/>
             <w:tcBorders>
               <w:top w:val="single" w:sz="4" w:space="0" w:color="auto"/>
               <w:bottom w:val="single" w:sz="4" w:space="0" w:color="auto"/>
@@ -1154,6 +1218,23 @@
               </w:rPr>
               <w:t>15, 16, 17, 18</w:t>
             </w:r>
+          </w:p>
+        </w:tc>
+        <w:tc>
+          <w:tcPr>
+            <w:tcW w:w="1843" w:type="dxa"/>
+            <w:tcBorders>
+              <w:top w:val="single" w:sz="4" w:space="0" w:color="auto"/>
+              <w:bottom w:val="single" w:sz="4" w:space="0" w:color="auto"/>
+            </w:tcBorders>
+          </w:tcPr>
+          <w:p>
+            <w:pPr>
+              <w:rPr>
+                <w:sz w:val="28"/>
+                <w:szCs w:val="28"/>
+              </w:rPr>
+            </w:pPr>
           </w:p>
         </w:tc>
       </w:tr>
@@ -1299,7 +1380,7 @@
       <w:rPr>
         <w:noProof/>
       </w:rPr>
-      <w:t>13.06.2025</w:t>
+      <w:t>26.09.2025</w:t>
     </w:r>
     <w:r>
       <w:fldChar w:fldCharType="end"/>

</xml_diff>

<commit_message>
Kurseinheit eingetragen, Merksatz hinzugefügt
</commit_message>
<xml_diff>
--- a/Doc/Inhalt_Programmierkurs.docx
+++ b/Doc/Inhalt_Programmierkurs.docx
@@ -1086,6 +1086,13 @@
                 <w:szCs w:val="28"/>
               </w:rPr>
               <w:t>7</w:t>
+            </w:r>
+            <w:r>
+              <w:rPr>
+                <w:sz w:val="28"/>
+                <w:szCs w:val="28"/>
+              </w:rPr>
+              <w:t>, 8</w:t>
             </w:r>
           </w:p>
         </w:tc>
@@ -1464,7 +1471,7 @@
       <w:rPr>
         <w:noProof/>
       </w:rPr>
-      <w:t>13.11.2025</w:t>
+      <w:t>22.11.2025</w:t>
     </w:r>
     <w:r>
       <w:fldChar w:fldCharType="end"/>

</xml_diff>

<commit_message>
Turtle-Merksätze ergänzt Kurseinheit eingetragen
</commit_message>
<xml_diff>
--- a/Doc/Inhalt_Programmierkurs.docx
+++ b/Doc/Inhalt_Programmierkurs.docx
@@ -245,8 +245,17 @@
                 <w:sz w:val="28"/>
                 <w:szCs w:val="28"/>
               </w:rPr>
-              <w:t>IDLE Shell und IDLE Editor</w:t>
-            </w:r>
+              <w:t xml:space="preserve">IDLE Shell und </w:t>
+            </w:r>
+            <w:proofErr w:type="gramStart"/>
+            <w:r>
+              <w:rPr>
+                <w:sz w:val="28"/>
+                <w:szCs w:val="28"/>
+              </w:rPr>
+              <w:t>IDLE Editor</w:t>
+            </w:r>
+            <w:proofErr w:type="gramEnd"/>
           </w:p>
         </w:tc>
         <w:tc>
@@ -1209,6 +1218,13 @@
                 <w:szCs w:val="28"/>
               </w:rPr>
             </w:pPr>
+            <w:r>
+              <w:rPr>
+                <w:sz w:val="28"/>
+                <w:szCs w:val="28"/>
+              </w:rPr>
+              <w:t>9</w:t>
+            </w:r>
           </w:p>
         </w:tc>
       </w:tr>
@@ -1471,7 +1487,7 @@
       <w:rPr>
         <w:noProof/>
       </w:rPr>
-      <w:t>22.11.2025</w:t>
+      <w:t>03.12.2025</w:t>
     </w:r>
     <w:r>
       <w:fldChar w:fldCharType="end"/>

</xml_diff>

<commit_message>
Merksätze ergänzt, Kurseinheit eingetragen
</commit_message>
<xml_diff>
--- a/Doc/Inhalt_Programmierkurs.docx
+++ b/Doc/Inhalt_Programmierkurs.docx
@@ -1360,6 +1360,13 @@
                 <w:szCs w:val="28"/>
               </w:rPr>
               <w:t>13</w:t>
+            </w:r>
+            <w:r>
+              <w:rPr>
+                <w:sz w:val="28"/>
+                <w:szCs w:val="28"/>
+              </w:rPr>
+              <w:t>, 14</w:t>
             </w:r>
           </w:p>
         </w:tc>
@@ -1506,7 +1513,7 @@
       <w:rPr>
         <w:noProof/>
       </w:rPr>
-      <w:t>28.01.2026</w:t>
+      <w:t>08.02.2026</w:t>
     </w:r>
     <w:r>
       <w:fldChar w:fldCharType="end"/>

</xml_diff>